<commit_message>
feat: Integrate budget management features
- Added new CSS and JS files for budget management in the application.
- Updated HTML to include new tabs and scripts for budget functionalities.
- Introduced new database tables for budget accounts and movements with appropriate policies and functions.
- Implemented validation and handling for budget updates and deletions in the application logic.
- Enhanced user interface to support budget input and display.
</commit_message>
<xml_diff>
--- a/templates/rekap belanja_draft.docx
+++ b/templates/rekap belanja_draft.docx
@@ -1,6 +1,6 @@
 
 <file path=word/document.xml><?xml version="1.0" encoding="utf-8"?>
-<w:document xmlns:wpc="http://schemas.microsoft.com/office/word/2010/wordprocessingCanvas" xmlns:cx="http://schemas.microsoft.com/office/drawing/2014/chartex" xmlns:cx1="http://schemas.microsoft.com/office/drawing/2015/9/8/chartex" xmlns:cx2="http://schemas.microsoft.com/office/drawing/2015/10/21/chartex" xmlns:cx3="http://schemas.microsoft.com/office/drawing/2016/5/9/chartex" xmlns:cx4="http://schemas.microsoft.com/office/drawing/2016/5/10/chartex" xmlns:cx5="http://schemas.microsoft.com/office/drawing/2016/5/11/chartex" xmlns:cx6="http://schemas.microsoft.com/office/drawing/2016/5/12/chartex" xmlns:cx7="http://schemas.microsoft.com/office/drawing/2016/5/13/chartex" xmlns:cx8="http://schemas.microsoft.com/office/drawing/2016/5/14/chartex" xmlns:mc="http://schemas.openxmlformats.org/markup-compatibility/2006" xmlns:aink="http://schemas.microsoft.com/office/drawing/2016/ink" xmlns:am3d="http://schemas.microsoft.com/office/drawing/2017/model3d" xmlns:o="urn:schemas-microsoft-com:office:office" xmlns:oel="http://schemas.microsoft.com/office/2019/extlst" xmlns:r="http://schemas.openxmlformats.org/officeDocument/2006/relationships" xmlns:m="http://schemas.openxmlformats.org/officeDocument/2006/math" xmlns:v="urn:schemas-microsoft-com:vml" xmlns:wp14="http://schemas.microsoft.com/office/word/2010/wordprocessingDrawing" xmlns:wp="http://schemas.openxmlformats.org/drawingml/2006/wordprocessingDrawing" xmlns:w10="urn:schemas-microsoft-com:office:word" xmlns:w="http://schemas.openxmlformats.org/wordprocessingml/2006/main" xmlns:w14="http://schemas.microsoft.com/office/word/2010/wordml" xmlns:w15="http://schemas.microsoft.com/office/word/2012/wordml" xmlns:w16cex="http://schemas.microsoft.com/office/word/2018/wordml/cex" xmlns:w16cid="http://schemas.microsoft.com/office/word/2016/wordml/cid" xmlns:w16="http://schemas.microsoft.com/office/word/2018/wordml" xmlns:w16sdtdh="http://schemas.microsoft.com/office/word/2020/wordml/sdtdatahash" xmlns:w16se="http://schemas.microsoft.com/office/word/2015/wordml/symex" xmlns:wpg="http://schemas.microsoft.com/office/word/2010/wordprocessingGroup" xmlns:wpi="http://schemas.microsoft.com/office/word/2010/wordprocessingInk" xmlns:wne="http://schemas.microsoft.com/office/word/2006/wordml" xmlns:wps="http://schemas.microsoft.com/office/word/2010/wordprocessingShape" mc:Ignorable="w14 w15 w16se w16cid w16 w16cex w16sdtdh wp14">
+<w:document xmlns:wpc="http://schemas.microsoft.com/office/word/2010/wordprocessingCanvas" xmlns:cx="http://schemas.microsoft.com/office/drawing/2014/chartex" xmlns:cx1="http://schemas.microsoft.com/office/drawing/2015/9/8/chartex" xmlns:cx2="http://schemas.microsoft.com/office/drawing/2015/10/21/chartex" xmlns:cx3="http://schemas.microsoft.com/office/drawing/2016/5/9/chartex" xmlns:cx4="http://schemas.microsoft.com/office/drawing/2016/5/10/chartex" xmlns:cx5="http://schemas.microsoft.com/office/drawing/2016/5/11/chartex" xmlns:cx6="http://schemas.microsoft.com/office/drawing/2016/5/12/chartex" xmlns:cx7="http://schemas.microsoft.com/office/drawing/2016/5/13/chartex" xmlns:cx8="http://schemas.microsoft.com/office/drawing/2016/5/14/chartex" xmlns:mc="http://schemas.openxmlformats.org/markup-compatibility/2006" xmlns:aink="http://schemas.microsoft.com/office/drawing/2016/ink" xmlns:am3d="http://schemas.microsoft.com/office/drawing/2017/model3d" xmlns:o="urn:schemas-microsoft-com:office:office" xmlns:oel="http://schemas.microsoft.com/office/2019/extlst" xmlns:r="http://schemas.openxmlformats.org/officeDocument/2006/relationships" xmlns:m="http://schemas.openxmlformats.org/officeDocument/2006/math" xmlns:v="urn:schemas-microsoft-com:vml" xmlns:wp14="http://schemas.microsoft.com/office/word/2010/wordprocessingDrawing" xmlns:wp="http://schemas.openxmlformats.org/drawingml/2006/wordprocessingDrawing" xmlns:w10="urn:schemas-microsoft-com:office:word" xmlns:w="http://schemas.openxmlformats.org/wordprocessingml/2006/main" xmlns:w14="http://schemas.microsoft.com/office/word/2010/wordml" xmlns:w15="http://schemas.microsoft.com/office/word/2012/wordml" xmlns:w16cex="http://schemas.microsoft.com/office/word/2018/wordml/cex" xmlns:w16cid="http://schemas.microsoft.com/office/word/2016/wordml/cid" xmlns:w16="http://schemas.microsoft.com/office/word/2018/wordml" xmlns:w16du="http://schemas.microsoft.com/office/word/2023/wordml/word16du" xmlns:w16sdtdh="http://schemas.microsoft.com/office/word/2020/wordml/sdtdatahash" xmlns:w16sdtfl="http://schemas.microsoft.com/office/word/2024/wordml/sdtformatlock" xmlns:w16se="http://schemas.microsoft.com/office/word/2015/wordml/symex" xmlns:wpg="http://schemas.microsoft.com/office/word/2010/wordprocessingGroup" xmlns:wpi="http://schemas.microsoft.com/office/word/2010/wordprocessingInk" xmlns:wne="http://schemas.microsoft.com/office/word/2006/wordml" xmlns:wps="http://schemas.microsoft.com/office/word/2010/wordprocessingShape" mc:Ignorable="w14 w15 w16se w16cid w16 w16cex w16sdtdh w16sdtfl w16du wp14">
   <w:body>
     <w:p>
       <w:pPr>
@@ -131,7 +131,6 @@
                 <w:szCs w:val="18"/>
               </w:rPr>
             </w:pPr>
-            <w:proofErr w:type="spellStart"/>
             <w:r>
               <w:rPr>
                 <w:rFonts w:ascii="Arial" w:hAnsi="Arial" w:cs="Arial"/>
@@ -139,17 +138,7 @@
                 <w:szCs w:val="18"/>
                 <w:lang w:val="en-US"/>
               </w:rPr>
-              <w:t>Tujuan</w:t>
-            </w:r>
-            <w:proofErr w:type="spellEnd"/>
-            <w:r>
-              <w:rPr>
-                <w:rFonts w:ascii="Arial" w:hAnsi="Arial" w:cs="Arial"/>
-                <w:sz w:val="18"/>
-                <w:szCs w:val="18"/>
-                <w:lang w:val="en-US"/>
-              </w:rPr>
-              <w:t xml:space="preserve"> </w:t>
+              <w:t xml:space="preserve">Tujuan </w:t>
             </w:r>
             <w:proofErr w:type="spellStart"/>
             <w:r>
@@ -1718,19 +1707,8 @@
                 <w:szCs w:val="18"/>
                 <w:lang w:val="en-US"/>
               </w:rPr>
-              <w:t xml:space="preserve">Uang </w:t>
-            </w:r>
-            <w:proofErr w:type="spellStart"/>
-            <w:r>
-              <w:rPr>
-                <w:rFonts w:ascii="Arial" w:hAnsi="Arial" w:cs="Arial"/>
-                <w:sz w:val="18"/>
-                <w:szCs w:val="18"/>
-                <w:lang w:val="en-US"/>
-              </w:rPr>
-              <w:t>Harian</w:t>
-            </w:r>
-            <w:proofErr w:type="spellEnd"/>
+              <w:t>Uang Harian</w:t>
+            </w:r>
           </w:p>
           <w:p>
             <w:pPr>
@@ -2076,19 +2054,8 @@
                 <w:szCs w:val="18"/>
                 <w:lang w:val="en-US"/>
               </w:rPr>
-              <w:t xml:space="preserve">Uang </w:t>
-            </w:r>
-            <w:proofErr w:type="spellStart"/>
-            <w:r>
-              <w:rPr>
-                <w:rFonts w:ascii="Arial" w:hAnsi="Arial" w:cs="Arial"/>
-                <w:sz w:val="18"/>
-                <w:szCs w:val="18"/>
-                <w:lang w:val="en-US"/>
-              </w:rPr>
-              <w:t>Harian</w:t>
-            </w:r>
-            <w:proofErr w:type="spellEnd"/>
+              <w:t>Uang Harian</w:t>
+            </w:r>
           </w:p>
           <w:p>
             <w:pPr>
@@ -2431,19 +2398,8 @@
                 <w:szCs w:val="18"/>
                 <w:lang w:val="en-US"/>
               </w:rPr>
-              <w:t xml:space="preserve">Uang </w:t>
-            </w:r>
-            <w:proofErr w:type="spellStart"/>
-            <w:r>
-              <w:rPr>
-                <w:rFonts w:ascii="Arial" w:hAnsi="Arial" w:cs="Arial"/>
-                <w:sz w:val="18"/>
-                <w:szCs w:val="18"/>
-                <w:lang w:val="en-US"/>
-              </w:rPr>
-              <w:t>Harian</w:t>
-            </w:r>
-            <w:proofErr w:type="spellEnd"/>
+              <w:t>Uang Harian</w:t>
+            </w:r>
           </w:p>
           <w:p>
             <w:pPr>
@@ -2496,7 +2452,67 @@
                 <w:sz w:val="18"/>
                 <w:szCs w:val="18"/>
               </w:rPr>
-              <w:t>{{uang_harian_3}} /</w:t>
+              <w:t>{{</w:t>
+            </w:r>
+            <w:r>
+              <w:rPr>
+                <w:rFonts w:ascii="Arial" w:eastAsia="Arial" w:hAnsi="Arial" w:cs="Arial"/>
+                <w:sz w:val="18"/>
+                <w:szCs w:val="18"/>
+                <w:lang w:val="en-US"/>
+              </w:rPr>
+              <w:t>lama</w:t>
+            </w:r>
+            <w:r>
+              <w:rPr>
+                <w:rFonts w:ascii="Arial" w:eastAsia="Arial" w:hAnsi="Arial" w:cs="Arial"/>
+                <w:sz w:val="18"/>
+                <w:szCs w:val="18"/>
+              </w:rPr>
+              <w:t>_</w:t>
+            </w:r>
+            <w:proofErr w:type="spellStart"/>
+            <w:r>
+              <w:rPr>
+                <w:rFonts w:ascii="Arial" w:eastAsia="Arial" w:hAnsi="Arial" w:cs="Arial"/>
+                <w:sz w:val="18"/>
+                <w:szCs w:val="18"/>
+                <w:lang w:val="en-US"/>
+              </w:rPr>
+              <w:t>perjalanan</w:t>
+            </w:r>
+            <w:proofErr w:type="spellEnd"/>
+            <w:r>
+              <w:rPr>
+                <w:rFonts w:ascii="Arial" w:eastAsia="Arial" w:hAnsi="Arial" w:cs="Arial"/>
+                <w:sz w:val="18"/>
+                <w:szCs w:val="18"/>
+              </w:rPr>
+              <w:t>_</w:t>
+            </w:r>
+            <w:r>
+              <w:rPr>
+                <w:rFonts w:ascii="Arial" w:eastAsia="Arial" w:hAnsi="Arial" w:cs="Arial"/>
+                <w:sz w:val="18"/>
+                <w:szCs w:val="18"/>
+              </w:rPr>
+              <w:t>3</w:t>
+            </w:r>
+            <w:r>
+              <w:rPr>
+                <w:rFonts w:ascii="Arial" w:eastAsia="Arial" w:hAnsi="Arial" w:cs="Arial"/>
+                <w:sz w:val="18"/>
+                <w:szCs w:val="18"/>
+              </w:rPr>
+              <w:t xml:space="preserve">}} </w:t>
+            </w:r>
+            <w:r>
+              <w:rPr>
+                <w:rFonts w:ascii="Arial" w:eastAsia="Arial" w:hAnsi="Arial" w:cs="Arial"/>
+                <w:sz w:val="18"/>
+                <w:szCs w:val="18"/>
+              </w:rPr>
+              <w:t>/</w:t>
             </w:r>
           </w:p>
           <w:p>
@@ -2750,19 +2766,8 @@
                 <w:szCs w:val="18"/>
                 <w:lang w:val="en-US"/>
               </w:rPr>
-              <w:t xml:space="preserve">Uang </w:t>
-            </w:r>
-            <w:proofErr w:type="spellStart"/>
-            <w:r>
-              <w:rPr>
-                <w:rFonts w:ascii="Arial" w:hAnsi="Arial" w:cs="Arial"/>
-                <w:sz w:val="18"/>
-                <w:szCs w:val="18"/>
-                <w:lang w:val="en-US"/>
-              </w:rPr>
-              <w:t>Harian</w:t>
-            </w:r>
-            <w:proofErr w:type="spellEnd"/>
+              <w:t>Uang Harian</w:t>
+            </w:r>
           </w:p>
           <w:p>
             <w:pPr>
@@ -2815,7 +2820,67 @@
                 <w:sz w:val="18"/>
                 <w:szCs w:val="18"/>
               </w:rPr>
-              <w:t>{{uang_harian_4}} /</w:t>
+              <w:t>{{</w:t>
+            </w:r>
+            <w:r>
+              <w:rPr>
+                <w:rFonts w:ascii="Arial" w:eastAsia="Arial" w:hAnsi="Arial" w:cs="Arial"/>
+                <w:sz w:val="18"/>
+                <w:szCs w:val="18"/>
+                <w:lang w:val="en-US"/>
+              </w:rPr>
+              <w:t>lama</w:t>
+            </w:r>
+            <w:r>
+              <w:rPr>
+                <w:rFonts w:ascii="Arial" w:eastAsia="Arial" w:hAnsi="Arial" w:cs="Arial"/>
+                <w:sz w:val="18"/>
+                <w:szCs w:val="18"/>
+              </w:rPr>
+              <w:t>_</w:t>
+            </w:r>
+            <w:proofErr w:type="spellStart"/>
+            <w:r>
+              <w:rPr>
+                <w:rFonts w:ascii="Arial" w:eastAsia="Arial" w:hAnsi="Arial" w:cs="Arial"/>
+                <w:sz w:val="18"/>
+                <w:szCs w:val="18"/>
+                <w:lang w:val="en-US"/>
+              </w:rPr>
+              <w:t>perjalanan</w:t>
+            </w:r>
+            <w:proofErr w:type="spellEnd"/>
+            <w:r>
+              <w:rPr>
+                <w:rFonts w:ascii="Arial" w:eastAsia="Arial" w:hAnsi="Arial" w:cs="Arial"/>
+                <w:sz w:val="18"/>
+                <w:szCs w:val="18"/>
+              </w:rPr>
+              <w:t>_</w:t>
+            </w:r>
+            <w:r>
+              <w:rPr>
+                <w:rFonts w:ascii="Arial" w:eastAsia="Arial" w:hAnsi="Arial" w:cs="Arial"/>
+                <w:sz w:val="18"/>
+                <w:szCs w:val="18"/>
+              </w:rPr>
+              <w:t>4</w:t>
+            </w:r>
+            <w:r>
+              <w:rPr>
+                <w:rFonts w:ascii="Arial" w:eastAsia="Arial" w:hAnsi="Arial" w:cs="Arial"/>
+                <w:sz w:val="18"/>
+                <w:szCs w:val="18"/>
+              </w:rPr>
+              <w:t xml:space="preserve">}} </w:t>
+            </w:r>
+            <w:r>
+              <w:rPr>
+                <w:rFonts w:ascii="Arial" w:eastAsia="Arial" w:hAnsi="Arial" w:cs="Arial"/>
+                <w:sz w:val="18"/>
+                <w:szCs w:val="18"/>
+              </w:rPr>
+              <w:t>/</w:t>
             </w:r>
           </w:p>
           <w:p>
@@ -3069,19 +3134,8 @@
                 <w:szCs w:val="18"/>
                 <w:lang w:val="en-US"/>
               </w:rPr>
-              <w:t xml:space="preserve">Uang </w:t>
-            </w:r>
-            <w:proofErr w:type="spellStart"/>
-            <w:r>
-              <w:rPr>
-                <w:rFonts w:ascii="Arial" w:hAnsi="Arial" w:cs="Arial"/>
-                <w:sz w:val="18"/>
-                <w:szCs w:val="18"/>
-                <w:lang w:val="en-US"/>
-              </w:rPr>
-              <w:t>Harian</w:t>
-            </w:r>
-            <w:proofErr w:type="spellEnd"/>
+              <w:t>Uang Harian</w:t>
+            </w:r>
           </w:p>
           <w:p>
             <w:pPr>
@@ -3134,7 +3188,67 @@
                 <w:sz w:val="18"/>
                 <w:szCs w:val="18"/>
               </w:rPr>
-              <w:t>{{uang_harian_5}} /</w:t>
+              <w:t>{{</w:t>
+            </w:r>
+            <w:r>
+              <w:rPr>
+                <w:rFonts w:ascii="Arial" w:eastAsia="Arial" w:hAnsi="Arial" w:cs="Arial"/>
+                <w:sz w:val="18"/>
+                <w:szCs w:val="18"/>
+                <w:lang w:val="en-US"/>
+              </w:rPr>
+              <w:t>lama</w:t>
+            </w:r>
+            <w:r>
+              <w:rPr>
+                <w:rFonts w:ascii="Arial" w:eastAsia="Arial" w:hAnsi="Arial" w:cs="Arial"/>
+                <w:sz w:val="18"/>
+                <w:szCs w:val="18"/>
+              </w:rPr>
+              <w:t>_</w:t>
+            </w:r>
+            <w:proofErr w:type="spellStart"/>
+            <w:r>
+              <w:rPr>
+                <w:rFonts w:ascii="Arial" w:eastAsia="Arial" w:hAnsi="Arial" w:cs="Arial"/>
+                <w:sz w:val="18"/>
+                <w:szCs w:val="18"/>
+                <w:lang w:val="en-US"/>
+              </w:rPr>
+              <w:t>perjalanan</w:t>
+            </w:r>
+            <w:proofErr w:type="spellEnd"/>
+            <w:r>
+              <w:rPr>
+                <w:rFonts w:ascii="Arial" w:eastAsia="Arial" w:hAnsi="Arial" w:cs="Arial"/>
+                <w:sz w:val="18"/>
+                <w:szCs w:val="18"/>
+              </w:rPr>
+              <w:t>_</w:t>
+            </w:r>
+            <w:r>
+              <w:rPr>
+                <w:rFonts w:ascii="Arial" w:eastAsia="Arial" w:hAnsi="Arial" w:cs="Arial"/>
+                <w:sz w:val="18"/>
+                <w:szCs w:val="18"/>
+              </w:rPr>
+              <w:t>5</w:t>
+            </w:r>
+            <w:r>
+              <w:rPr>
+                <w:rFonts w:ascii="Arial" w:eastAsia="Arial" w:hAnsi="Arial" w:cs="Arial"/>
+                <w:sz w:val="18"/>
+                <w:szCs w:val="18"/>
+              </w:rPr>
+              <w:t xml:space="preserve">}} </w:t>
+            </w:r>
+            <w:r>
+              <w:rPr>
+                <w:rFonts w:ascii="Arial" w:eastAsia="Arial" w:hAnsi="Arial" w:cs="Arial"/>
+                <w:sz w:val="18"/>
+                <w:szCs w:val="18"/>
+              </w:rPr>
+              <w:t>/</w:t>
             </w:r>
           </w:p>
           <w:p>
@@ -3404,19 +3518,8 @@
                 <w:szCs w:val="18"/>
                 <w:lang w:val="en-US"/>
               </w:rPr>
-              <w:t xml:space="preserve">Uang </w:t>
-            </w:r>
-            <w:proofErr w:type="spellStart"/>
-            <w:r>
-              <w:rPr>
-                <w:rFonts w:ascii="Arial" w:hAnsi="Arial" w:cs="Arial"/>
-                <w:sz w:val="18"/>
-                <w:szCs w:val="18"/>
-                <w:lang w:val="en-US"/>
-              </w:rPr>
-              <w:t>Harian</w:t>
-            </w:r>
-            <w:proofErr w:type="spellEnd"/>
+              <w:t>Uang Harian</w:t>
+            </w:r>
           </w:p>
           <w:p>
             <w:pPr>
@@ -3469,13 +3572,49 @@
                 <w:sz w:val="18"/>
                 <w:szCs w:val="18"/>
               </w:rPr>
-              <w:t>{{uang_harian_</w:t>
+              <w:t>{{</w:t>
             </w:r>
             <w:r>
               <w:rPr>
                 <w:rFonts w:ascii="Arial" w:eastAsia="Arial" w:hAnsi="Arial" w:cs="Arial"/>
                 <w:sz w:val="18"/>
                 <w:szCs w:val="18"/>
+                <w:lang w:val="en-US"/>
+              </w:rPr>
+              <w:t>lama</w:t>
+            </w:r>
+            <w:r>
+              <w:rPr>
+                <w:rFonts w:ascii="Arial" w:eastAsia="Arial" w:hAnsi="Arial" w:cs="Arial"/>
+                <w:sz w:val="18"/>
+                <w:szCs w:val="18"/>
+              </w:rPr>
+              <w:t>_</w:t>
+            </w:r>
+            <w:proofErr w:type="spellStart"/>
+            <w:r>
+              <w:rPr>
+                <w:rFonts w:ascii="Arial" w:eastAsia="Arial" w:hAnsi="Arial" w:cs="Arial"/>
+                <w:sz w:val="18"/>
+                <w:szCs w:val="18"/>
+                <w:lang w:val="en-US"/>
+              </w:rPr>
+              <w:t>perjalanan</w:t>
+            </w:r>
+            <w:proofErr w:type="spellEnd"/>
+            <w:r>
+              <w:rPr>
+                <w:rFonts w:ascii="Arial" w:eastAsia="Arial" w:hAnsi="Arial" w:cs="Arial"/>
+                <w:sz w:val="18"/>
+                <w:szCs w:val="18"/>
+              </w:rPr>
+              <w:t>_</w:t>
+            </w:r>
+            <w:r>
+              <w:rPr>
+                <w:rFonts w:ascii="Arial" w:eastAsia="Arial" w:hAnsi="Arial" w:cs="Arial"/>
+                <w:sz w:val="18"/>
+                <w:szCs w:val="18"/>
               </w:rPr>
               <w:t>6</w:t>
             </w:r>
@@ -3485,7 +3624,15 @@
                 <w:sz w:val="18"/>
                 <w:szCs w:val="18"/>
               </w:rPr>
-              <w:t>}} /</w:t>
+              <w:t xml:space="preserve">}} </w:t>
+            </w:r>
+            <w:r>
+              <w:rPr>
+                <w:rFonts w:ascii="Arial" w:eastAsia="Arial" w:hAnsi="Arial" w:cs="Arial"/>
+                <w:sz w:val="18"/>
+                <w:szCs w:val="18"/>
+              </w:rPr>
+              <w:t>/</w:t>
             </w:r>
           </w:p>
           <w:p>
@@ -3850,19 +3997,8 @@
                 <w:szCs w:val="18"/>
                 <w:lang w:val="en-US"/>
               </w:rPr>
-              <w:t xml:space="preserve">Uang </w:t>
-            </w:r>
-            <w:proofErr w:type="spellStart"/>
-            <w:r>
-              <w:rPr>
-                <w:rFonts w:ascii="Arial" w:hAnsi="Arial" w:cs="Arial"/>
-                <w:sz w:val="18"/>
-                <w:szCs w:val="18"/>
-                <w:lang w:val="en-US"/>
-              </w:rPr>
-              <w:t>Harian</w:t>
-            </w:r>
-            <w:proofErr w:type="spellEnd"/>
+              <w:t>Uang Harian</w:t>
+            </w:r>
           </w:p>
           <w:p>
             <w:pPr>
@@ -3915,13 +4051,49 @@
                 <w:sz w:val="18"/>
                 <w:szCs w:val="18"/>
               </w:rPr>
-              <w:t>{{uang_harian_</w:t>
+              <w:t>{{</w:t>
             </w:r>
             <w:r>
               <w:rPr>
                 <w:rFonts w:ascii="Arial" w:eastAsia="Arial" w:hAnsi="Arial" w:cs="Arial"/>
                 <w:sz w:val="18"/>
                 <w:szCs w:val="18"/>
+                <w:lang w:val="en-US"/>
+              </w:rPr>
+              <w:t>lama</w:t>
+            </w:r>
+            <w:r>
+              <w:rPr>
+                <w:rFonts w:ascii="Arial" w:eastAsia="Arial" w:hAnsi="Arial" w:cs="Arial"/>
+                <w:sz w:val="18"/>
+                <w:szCs w:val="18"/>
+              </w:rPr>
+              <w:t>_</w:t>
+            </w:r>
+            <w:proofErr w:type="spellStart"/>
+            <w:r>
+              <w:rPr>
+                <w:rFonts w:ascii="Arial" w:eastAsia="Arial" w:hAnsi="Arial" w:cs="Arial"/>
+                <w:sz w:val="18"/>
+                <w:szCs w:val="18"/>
+                <w:lang w:val="en-US"/>
+              </w:rPr>
+              <w:t>perjalanan</w:t>
+            </w:r>
+            <w:proofErr w:type="spellEnd"/>
+            <w:r>
+              <w:rPr>
+                <w:rFonts w:ascii="Arial" w:eastAsia="Arial" w:hAnsi="Arial" w:cs="Arial"/>
+                <w:sz w:val="18"/>
+                <w:szCs w:val="18"/>
+              </w:rPr>
+              <w:t>_</w:t>
+            </w:r>
+            <w:r>
+              <w:rPr>
+                <w:rFonts w:ascii="Arial" w:eastAsia="Arial" w:hAnsi="Arial" w:cs="Arial"/>
+                <w:sz w:val="18"/>
+                <w:szCs w:val="18"/>
               </w:rPr>
               <w:t>7</w:t>
             </w:r>
@@ -3931,7 +4103,15 @@
                 <w:sz w:val="18"/>
                 <w:szCs w:val="18"/>
               </w:rPr>
-              <w:t>}} /</w:t>
+              <w:t xml:space="preserve">}} </w:t>
+            </w:r>
+            <w:r>
+              <w:rPr>
+                <w:rFonts w:ascii="Arial" w:eastAsia="Arial" w:hAnsi="Arial" w:cs="Arial"/>
+                <w:sz w:val="18"/>
+                <w:szCs w:val="18"/>
+              </w:rPr>
+              <w:t>/</w:t>
             </w:r>
           </w:p>
           <w:p>
@@ -5383,7 +5563,7 @@
 </file>
 
 <file path=word/endnotes.xml><?xml version="1.0" encoding="utf-8"?>
-<w:endnotes xmlns:wpc="http://schemas.microsoft.com/office/word/2010/wordprocessingCanvas" xmlns:cx="http://schemas.microsoft.com/office/drawing/2014/chartex" xmlns:cx1="http://schemas.microsoft.com/office/drawing/2015/9/8/chartex" xmlns:cx2="http://schemas.microsoft.com/office/drawing/2015/10/21/chartex" xmlns:cx3="http://schemas.microsoft.com/office/drawing/2016/5/9/chartex" xmlns:cx4="http://schemas.microsoft.com/office/drawing/2016/5/10/chartex" xmlns:cx5="http://schemas.microsoft.com/office/drawing/2016/5/11/chartex" xmlns:cx6="http://schemas.microsoft.com/office/drawing/2016/5/12/chartex" xmlns:cx7="http://schemas.microsoft.com/office/drawing/2016/5/13/chartex" xmlns:cx8="http://schemas.microsoft.com/office/drawing/2016/5/14/chartex" xmlns:mc="http://schemas.openxmlformats.org/markup-compatibility/2006" xmlns:aink="http://schemas.microsoft.com/office/drawing/2016/ink" xmlns:am3d="http://schemas.microsoft.com/office/drawing/2017/model3d" xmlns:o="urn:schemas-microsoft-com:office:office" xmlns:oel="http://schemas.microsoft.com/office/2019/extlst" xmlns:r="http://schemas.openxmlformats.org/officeDocument/2006/relationships" xmlns:m="http://schemas.openxmlformats.org/officeDocument/2006/math" xmlns:v="urn:schemas-microsoft-com:vml" xmlns:wp14="http://schemas.microsoft.com/office/word/2010/wordprocessingDrawing" xmlns:wp="http://schemas.openxmlformats.org/drawingml/2006/wordprocessingDrawing" xmlns:w10="urn:schemas-microsoft-com:office:word" xmlns:w="http://schemas.openxmlformats.org/wordprocessingml/2006/main" xmlns:w14="http://schemas.microsoft.com/office/word/2010/wordml" xmlns:w15="http://schemas.microsoft.com/office/word/2012/wordml" xmlns:w16cex="http://schemas.microsoft.com/office/word/2018/wordml/cex" xmlns:w16cid="http://schemas.microsoft.com/office/word/2016/wordml/cid" xmlns:w16="http://schemas.microsoft.com/office/word/2018/wordml" xmlns:w16sdtdh="http://schemas.microsoft.com/office/word/2020/wordml/sdtdatahash" xmlns:w16se="http://schemas.microsoft.com/office/word/2015/wordml/symex" xmlns:wpg="http://schemas.microsoft.com/office/word/2010/wordprocessingGroup" xmlns:wpi="http://schemas.microsoft.com/office/word/2010/wordprocessingInk" xmlns:wne="http://schemas.microsoft.com/office/word/2006/wordml" xmlns:wps="http://schemas.microsoft.com/office/word/2010/wordprocessingShape" mc:Ignorable="w14 w15 w16se w16cid w16 w16cex w16sdtdh wp14">
+<w:endnotes xmlns:wpc="http://schemas.microsoft.com/office/word/2010/wordprocessingCanvas" xmlns:cx="http://schemas.microsoft.com/office/drawing/2014/chartex" xmlns:cx1="http://schemas.microsoft.com/office/drawing/2015/9/8/chartex" xmlns:cx2="http://schemas.microsoft.com/office/drawing/2015/10/21/chartex" xmlns:cx3="http://schemas.microsoft.com/office/drawing/2016/5/9/chartex" xmlns:cx4="http://schemas.microsoft.com/office/drawing/2016/5/10/chartex" xmlns:cx5="http://schemas.microsoft.com/office/drawing/2016/5/11/chartex" xmlns:cx6="http://schemas.microsoft.com/office/drawing/2016/5/12/chartex" xmlns:cx7="http://schemas.microsoft.com/office/drawing/2016/5/13/chartex" xmlns:cx8="http://schemas.microsoft.com/office/drawing/2016/5/14/chartex" xmlns:mc="http://schemas.openxmlformats.org/markup-compatibility/2006" xmlns:aink="http://schemas.microsoft.com/office/drawing/2016/ink" xmlns:am3d="http://schemas.microsoft.com/office/drawing/2017/model3d" xmlns:o="urn:schemas-microsoft-com:office:office" xmlns:oel="http://schemas.microsoft.com/office/2019/extlst" xmlns:r="http://schemas.openxmlformats.org/officeDocument/2006/relationships" xmlns:m="http://schemas.openxmlformats.org/officeDocument/2006/math" xmlns:v="urn:schemas-microsoft-com:vml" xmlns:wp14="http://schemas.microsoft.com/office/word/2010/wordprocessingDrawing" xmlns:wp="http://schemas.openxmlformats.org/drawingml/2006/wordprocessingDrawing" xmlns:w10="urn:schemas-microsoft-com:office:word" xmlns:w="http://schemas.openxmlformats.org/wordprocessingml/2006/main" xmlns:w14="http://schemas.microsoft.com/office/word/2010/wordml" xmlns:w15="http://schemas.microsoft.com/office/word/2012/wordml" xmlns:w16cex="http://schemas.microsoft.com/office/word/2018/wordml/cex" xmlns:w16cid="http://schemas.microsoft.com/office/word/2016/wordml/cid" xmlns:w16="http://schemas.microsoft.com/office/word/2018/wordml" xmlns:w16du="http://schemas.microsoft.com/office/word/2023/wordml/word16du" xmlns:w16sdtdh="http://schemas.microsoft.com/office/word/2020/wordml/sdtdatahash" xmlns:w16sdtfl="http://schemas.microsoft.com/office/word/2024/wordml/sdtformatlock" xmlns:w16se="http://schemas.microsoft.com/office/word/2015/wordml/symex" xmlns:wpg="http://schemas.microsoft.com/office/word/2010/wordprocessingGroup" xmlns:wpi="http://schemas.microsoft.com/office/word/2010/wordprocessingInk" xmlns:wne="http://schemas.microsoft.com/office/word/2006/wordml" xmlns:wps="http://schemas.microsoft.com/office/word/2010/wordprocessingShape" mc:Ignorable="w14 w15 w16se w16cid w16 w16cex w16sdtdh w16sdtfl w16du wp14">
   <w:endnote w:type="separator" w:id="-1">
     <w:p>
       <w:pPr>
@@ -5408,7 +5588,7 @@
 </file>
 
 <file path=word/footnotes.xml><?xml version="1.0" encoding="utf-8"?>
-<w:footnotes xmlns:wpc="http://schemas.microsoft.com/office/word/2010/wordprocessingCanvas" xmlns:cx="http://schemas.microsoft.com/office/drawing/2014/chartex" xmlns:cx1="http://schemas.microsoft.com/office/drawing/2015/9/8/chartex" xmlns:cx2="http://schemas.microsoft.com/office/drawing/2015/10/21/chartex" xmlns:cx3="http://schemas.microsoft.com/office/drawing/2016/5/9/chartex" xmlns:cx4="http://schemas.microsoft.com/office/drawing/2016/5/10/chartex" xmlns:cx5="http://schemas.microsoft.com/office/drawing/2016/5/11/chartex" xmlns:cx6="http://schemas.microsoft.com/office/drawing/2016/5/12/chartex" xmlns:cx7="http://schemas.microsoft.com/office/drawing/2016/5/13/chartex" xmlns:cx8="http://schemas.microsoft.com/office/drawing/2016/5/14/chartex" xmlns:mc="http://schemas.openxmlformats.org/markup-compatibility/2006" xmlns:aink="http://schemas.microsoft.com/office/drawing/2016/ink" xmlns:am3d="http://schemas.microsoft.com/office/drawing/2017/model3d" xmlns:o="urn:schemas-microsoft-com:office:office" xmlns:oel="http://schemas.microsoft.com/office/2019/extlst" xmlns:r="http://schemas.openxmlformats.org/officeDocument/2006/relationships" xmlns:m="http://schemas.openxmlformats.org/officeDocument/2006/math" xmlns:v="urn:schemas-microsoft-com:vml" xmlns:wp14="http://schemas.microsoft.com/office/word/2010/wordprocessingDrawing" xmlns:wp="http://schemas.openxmlformats.org/drawingml/2006/wordprocessingDrawing" xmlns:w10="urn:schemas-microsoft-com:office:word" xmlns:w="http://schemas.openxmlformats.org/wordprocessingml/2006/main" xmlns:w14="http://schemas.microsoft.com/office/word/2010/wordml" xmlns:w15="http://schemas.microsoft.com/office/word/2012/wordml" xmlns:w16cex="http://schemas.microsoft.com/office/word/2018/wordml/cex" xmlns:w16cid="http://schemas.microsoft.com/office/word/2016/wordml/cid" xmlns:w16="http://schemas.microsoft.com/office/word/2018/wordml" xmlns:w16sdtdh="http://schemas.microsoft.com/office/word/2020/wordml/sdtdatahash" xmlns:w16se="http://schemas.microsoft.com/office/word/2015/wordml/symex" xmlns:wpg="http://schemas.microsoft.com/office/word/2010/wordprocessingGroup" xmlns:wpi="http://schemas.microsoft.com/office/word/2010/wordprocessingInk" xmlns:wne="http://schemas.microsoft.com/office/word/2006/wordml" xmlns:wps="http://schemas.microsoft.com/office/word/2010/wordprocessingShape" mc:Ignorable="w14 w15 w16se w16cid w16 w16cex w16sdtdh wp14">
+<w:footnotes xmlns:wpc="http://schemas.microsoft.com/office/word/2010/wordprocessingCanvas" xmlns:cx="http://schemas.microsoft.com/office/drawing/2014/chartex" xmlns:cx1="http://schemas.microsoft.com/office/drawing/2015/9/8/chartex" xmlns:cx2="http://schemas.microsoft.com/office/drawing/2015/10/21/chartex" xmlns:cx3="http://schemas.microsoft.com/office/drawing/2016/5/9/chartex" xmlns:cx4="http://schemas.microsoft.com/office/drawing/2016/5/10/chartex" xmlns:cx5="http://schemas.microsoft.com/office/drawing/2016/5/11/chartex" xmlns:cx6="http://schemas.microsoft.com/office/drawing/2016/5/12/chartex" xmlns:cx7="http://schemas.microsoft.com/office/drawing/2016/5/13/chartex" xmlns:cx8="http://schemas.microsoft.com/office/drawing/2016/5/14/chartex" xmlns:mc="http://schemas.openxmlformats.org/markup-compatibility/2006" xmlns:aink="http://schemas.microsoft.com/office/drawing/2016/ink" xmlns:am3d="http://schemas.microsoft.com/office/drawing/2017/model3d" xmlns:o="urn:schemas-microsoft-com:office:office" xmlns:oel="http://schemas.microsoft.com/office/2019/extlst" xmlns:r="http://schemas.openxmlformats.org/officeDocument/2006/relationships" xmlns:m="http://schemas.openxmlformats.org/officeDocument/2006/math" xmlns:v="urn:schemas-microsoft-com:vml" xmlns:wp14="http://schemas.microsoft.com/office/word/2010/wordprocessingDrawing" xmlns:wp="http://schemas.openxmlformats.org/drawingml/2006/wordprocessingDrawing" xmlns:w10="urn:schemas-microsoft-com:office:word" xmlns:w="http://schemas.openxmlformats.org/wordprocessingml/2006/main" xmlns:w14="http://schemas.microsoft.com/office/word/2010/wordml" xmlns:w15="http://schemas.microsoft.com/office/word/2012/wordml" xmlns:w16cex="http://schemas.microsoft.com/office/word/2018/wordml/cex" xmlns:w16cid="http://schemas.microsoft.com/office/word/2016/wordml/cid" xmlns:w16="http://schemas.microsoft.com/office/word/2018/wordml" xmlns:w16du="http://schemas.microsoft.com/office/word/2023/wordml/word16du" xmlns:w16sdtdh="http://schemas.microsoft.com/office/word/2020/wordml/sdtdatahash" xmlns:w16sdtfl="http://schemas.microsoft.com/office/word/2024/wordml/sdtformatlock" xmlns:w16se="http://schemas.microsoft.com/office/word/2015/wordml/symex" xmlns:wpg="http://schemas.microsoft.com/office/word/2010/wordprocessingGroup" xmlns:wpi="http://schemas.microsoft.com/office/word/2010/wordprocessingInk" xmlns:wne="http://schemas.microsoft.com/office/word/2006/wordml" xmlns:wps="http://schemas.microsoft.com/office/word/2010/wordprocessingShape" mc:Ignorable="w14 w15 w16se w16cid w16 w16cex w16sdtdh w16sdtfl w16du wp14">
   <w:footnote w:type="separator" w:id="-1">
     <w:p>
       <w:pPr>
@@ -5433,7 +5613,7 @@
 </file>
 
 <file path=word/numbering.xml><?xml version="1.0" encoding="utf-8"?>
-<w:numbering xmlns:wpc="http://schemas.microsoft.com/office/word/2010/wordprocessingCanvas" xmlns:cx="http://schemas.microsoft.com/office/drawing/2014/chartex" xmlns:cx1="http://schemas.microsoft.com/office/drawing/2015/9/8/chartex" xmlns:cx2="http://schemas.microsoft.com/office/drawing/2015/10/21/chartex" xmlns:cx3="http://schemas.microsoft.com/office/drawing/2016/5/9/chartex" xmlns:cx4="http://schemas.microsoft.com/office/drawing/2016/5/10/chartex" xmlns:cx5="http://schemas.microsoft.com/office/drawing/2016/5/11/chartex" xmlns:cx6="http://schemas.microsoft.com/office/drawing/2016/5/12/chartex" xmlns:cx7="http://schemas.microsoft.com/office/drawing/2016/5/13/chartex" xmlns:cx8="http://schemas.microsoft.com/office/drawing/2016/5/14/chartex" xmlns:mc="http://schemas.openxmlformats.org/markup-compatibility/2006" xmlns:aink="http://schemas.microsoft.com/office/drawing/2016/ink" xmlns:am3d="http://schemas.microsoft.com/office/drawing/2017/model3d" xmlns:o="urn:schemas-microsoft-com:office:office" xmlns:oel="http://schemas.microsoft.com/office/2019/extlst" xmlns:r="http://schemas.openxmlformats.org/officeDocument/2006/relationships" xmlns:m="http://schemas.openxmlformats.org/officeDocument/2006/math" xmlns:v="urn:schemas-microsoft-com:vml" xmlns:wp14="http://schemas.microsoft.com/office/word/2010/wordprocessingDrawing" xmlns:wp="http://schemas.openxmlformats.org/drawingml/2006/wordprocessingDrawing" xmlns:w10="urn:schemas-microsoft-com:office:word" xmlns:w="http://schemas.openxmlformats.org/wordprocessingml/2006/main" xmlns:w14="http://schemas.microsoft.com/office/word/2010/wordml" xmlns:w15="http://schemas.microsoft.com/office/word/2012/wordml" xmlns:w16cex="http://schemas.microsoft.com/office/word/2018/wordml/cex" xmlns:w16cid="http://schemas.microsoft.com/office/word/2016/wordml/cid" xmlns:w16="http://schemas.microsoft.com/office/word/2018/wordml" xmlns:w16sdtdh="http://schemas.microsoft.com/office/word/2020/wordml/sdtdatahash" xmlns:w16se="http://schemas.microsoft.com/office/word/2015/wordml/symex" xmlns:wpg="http://schemas.microsoft.com/office/word/2010/wordprocessingGroup" xmlns:wpi="http://schemas.microsoft.com/office/word/2010/wordprocessingInk" xmlns:wne="http://schemas.microsoft.com/office/word/2006/wordml" xmlns:wps="http://schemas.microsoft.com/office/word/2010/wordprocessingShape" mc:Ignorable="w14 w15 w16se w16cid w16 w16cex w16sdtdh wp14">
+<w:numbering xmlns:wpc="http://schemas.microsoft.com/office/word/2010/wordprocessingCanvas" xmlns:cx="http://schemas.microsoft.com/office/drawing/2014/chartex" xmlns:cx1="http://schemas.microsoft.com/office/drawing/2015/9/8/chartex" xmlns:cx2="http://schemas.microsoft.com/office/drawing/2015/10/21/chartex" xmlns:cx3="http://schemas.microsoft.com/office/drawing/2016/5/9/chartex" xmlns:cx4="http://schemas.microsoft.com/office/drawing/2016/5/10/chartex" xmlns:cx5="http://schemas.microsoft.com/office/drawing/2016/5/11/chartex" xmlns:cx6="http://schemas.microsoft.com/office/drawing/2016/5/12/chartex" xmlns:cx7="http://schemas.microsoft.com/office/drawing/2016/5/13/chartex" xmlns:cx8="http://schemas.microsoft.com/office/drawing/2016/5/14/chartex" xmlns:mc="http://schemas.openxmlformats.org/markup-compatibility/2006" xmlns:aink="http://schemas.microsoft.com/office/drawing/2016/ink" xmlns:am3d="http://schemas.microsoft.com/office/drawing/2017/model3d" xmlns:o="urn:schemas-microsoft-com:office:office" xmlns:oel="http://schemas.microsoft.com/office/2019/extlst" xmlns:r="http://schemas.openxmlformats.org/officeDocument/2006/relationships" xmlns:m="http://schemas.openxmlformats.org/officeDocument/2006/math" xmlns:v="urn:schemas-microsoft-com:vml" xmlns:wp14="http://schemas.microsoft.com/office/word/2010/wordprocessingDrawing" xmlns:wp="http://schemas.openxmlformats.org/drawingml/2006/wordprocessingDrawing" xmlns:w10="urn:schemas-microsoft-com:office:word" xmlns:w="http://schemas.openxmlformats.org/wordprocessingml/2006/main" xmlns:w14="http://schemas.microsoft.com/office/word/2010/wordml" xmlns:w15="http://schemas.microsoft.com/office/word/2012/wordml" xmlns:w16cex="http://schemas.microsoft.com/office/word/2018/wordml/cex" xmlns:w16cid="http://schemas.microsoft.com/office/word/2016/wordml/cid" xmlns:w16="http://schemas.microsoft.com/office/word/2018/wordml" xmlns:w16du="http://schemas.microsoft.com/office/word/2023/wordml/word16du" xmlns:w16sdtdh="http://schemas.microsoft.com/office/word/2020/wordml/sdtdatahash" xmlns:w16sdtfl="http://schemas.microsoft.com/office/word/2024/wordml/sdtformatlock" xmlns:w16se="http://schemas.microsoft.com/office/word/2015/wordml/symex" xmlns:wpg="http://schemas.microsoft.com/office/word/2010/wordprocessingGroup" xmlns:wpi="http://schemas.microsoft.com/office/word/2010/wordprocessingInk" xmlns:wne="http://schemas.microsoft.com/office/word/2006/wordml" xmlns:wps="http://schemas.microsoft.com/office/word/2010/wordprocessingShape" mc:Ignorable="w14 w15 w16se w16cid w16 w16cex w16sdtdh w16sdtfl w16du wp14">
   <w:abstractNum w:abstractNumId="0" w15:restartNumberingAfterBreak="0">
     <w:nsid w:val="07382274"/>
     <w:multiLevelType w:val="multilevel"/>
@@ -6174,7 +6354,7 @@
 </file>
 
 <file path=word/styles.xml><?xml version="1.0" encoding="utf-8"?>
-<w:styles xmlns:mc="http://schemas.openxmlformats.org/markup-compatibility/2006" xmlns:r="http://schemas.openxmlformats.org/officeDocument/2006/relationships" xmlns:w="http://schemas.openxmlformats.org/wordprocessingml/2006/main" xmlns:w14="http://schemas.microsoft.com/office/word/2010/wordml" xmlns:w15="http://schemas.microsoft.com/office/word/2012/wordml" xmlns:w16cex="http://schemas.microsoft.com/office/word/2018/wordml/cex" xmlns:w16cid="http://schemas.microsoft.com/office/word/2016/wordml/cid" xmlns:w16="http://schemas.microsoft.com/office/word/2018/wordml" xmlns:w16sdtdh="http://schemas.microsoft.com/office/word/2020/wordml/sdtdatahash" xmlns:w16se="http://schemas.microsoft.com/office/word/2015/wordml/symex" mc:Ignorable="w14 w15 w16se w16cid w16 w16cex w16sdtdh">
+<w:styles xmlns:mc="http://schemas.openxmlformats.org/markup-compatibility/2006" xmlns:r="http://schemas.openxmlformats.org/officeDocument/2006/relationships" xmlns:w="http://schemas.openxmlformats.org/wordprocessingml/2006/main" xmlns:w14="http://schemas.microsoft.com/office/word/2010/wordml" xmlns:w15="http://schemas.microsoft.com/office/word/2012/wordml" xmlns:w16cex="http://schemas.microsoft.com/office/word/2018/wordml/cex" xmlns:w16cid="http://schemas.microsoft.com/office/word/2016/wordml/cid" xmlns:w16="http://schemas.microsoft.com/office/word/2018/wordml" xmlns:w16du="http://schemas.microsoft.com/office/word/2023/wordml/word16du" xmlns:w16sdtdh="http://schemas.microsoft.com/office/word/2020/wordml/sdtdatahash" xmlns:w16sdtfl="http://schemas.microsoft.com/office/word/2024/wordml/sdtformatlock" xmlns:w16se="http://schemas.microsoft.com/office/word/2015/wordml/symex" mc:Ignorable="w14 w15 w16se w16cid w16 w16cex w16sdtdh w16sdtfl w16du">
   <w:docDefaults>
     <w:rPrDefault>
       <w:rPr>

</xml_diff>